<commit_message>
commit code tạo mới hồ sơ gỗ
</commit_message>
<xml_diff>
--- a/my_custom_addons/dl_wood_traceability/static/TEMPLATES/TEMPLATE_PAKT.docx
+++ b/my_custom_addons/dl_wood_traceability/static/TEMPLATES/TEMPLATE_PAKT.docx
@@ -131,7 +131,21 @@
           <w:sz w:val="26"/>
           <w:szCs w:val="26"/>
         </w:rPr>
-        <w:t>{forestOwner</w:t>
+        <w:t>{</w:t>
+      </w:r>
+      <w:r>
+        <w:rPr>
+          <w:sz w:val="26"/>
+          <w:szCs w:val="26"/>
+        </w:rPr>
+        <w:t>{</w:t>
+      </w:r>
+      <w:r>
+        <w:rPr>
+          <w:sz w:val="26"/>
+          <w:szCs w:val="26"/>
+        </w:rPr>
+        <w:t>forestOwner</w:t>
       </w:r>
       <w:r>
         <w:rPr>
@@ -147,6 +161,13 @@
         </w:rPr>
         <w:t>}</w:t>
       </w:r>
+      <w:r>
+        <w:rPr>
+          <w:sz w:val="26"/>
+          <w:szCs w:val="26"/>
+        </w:rPr>
+        <w:t>}</w:t>
+      </w:r>
     </w:p>
     <w:p>
       <w:pPr>
@@ -164,7 +185,35 @@
           <w:sz w:val="26"/>
           <w:szCs w:val="26"/>
         </w:rPr>
-        <w:t>{foestOwnerCccd}</w:t>
+        <w:t>{</w:t>
+      </w:r>
+      <w:r>
+        <w:rPr>
+          <w:sz w:val="26"/>
+          <w:szCs w:val="26"/>
+        </w:rPr>
+        <w:t>{</w:t>
+      </w:r>
+      <w:r>
+        <w:rPr>
+          <w:sz w:val="26"/>
+          <w:szCs w:val="26"/>
+        </w:rPr>
+        <w:t>foestOwnerCccd</w:t>
+      </w:r>
+      <w:r>
+        <w:rPr>
+          <w:sz w:val="26"/>
+          <w:szCs w:val="26"/>
+        </w:rPr>
+        <w:t>}</w:t>
+      </w:r>
+      <w:r>
+        <w:rPr>
+          <w:sz w:val="26"/>
+          <w:szCs w:val="26"/>
+        </w:rPr>
+        <w:t>}</w:t>
       </w:r>
     </w:p>
     <w:p>
@@ -183,7 +232,35 @@
           <w:sz w:val="26"/>
           <w:szCs w:val="26"/>
         </w:rPr>
-        <w:t>{forestOwnerAddr}</w:t>
+        <w:t>{</w:t>
+      </w:r>
+      <w:r>
+        <w:rPr>
+          <w:sz w:val="26"/>
+          <w:szCs w:val="26"/>
+        </w:rPr>
+        <w:t>{</w:t>
+      </w:r>
+      <w:r>
+        <w:rPr>
+          <w:sz w:val="26"/>
+          <w:szCs w:val="26"/>
+        </w:rPr>
+        <w:t>forestOwnerAddr</w:t>
+      </w:r>
+      <w:r>
+        <w:rPr>
+          <w:sz w:val="26"/>
+          <w:szCs w:val="26"/>
+        </w:rPr>
+        <w:t>}</w:t>
+      </w:r>
+      <w:r>
+        <w:rPr>
+          <w:sz w:val="26"/>
+          <w:szCs w:val="26"/>
+        </w:rPr>
+        <w:t>}</w:t>
       </w:r>
     </w:p>
     <w:p>
@@ -202,7 +279,35 @@
           <w:sz w:val="26"/>
           <w:szCs w:val="26"/>
         </w:rPr>
-        <w:t>{forestOwnerPhoneNumber}</w:t>
+        <w:t>{</w:t>
+      </w:r>
+      <w:r>
+        <w:rPr>
+          <w:sz w:val="26"/>
+          <w:szCs w:val="26"/>
+        </w:rPr>
+        <w:t>{</w:t>
+      </w:r>
+      <w:r>
+        <w:rPr>
+          <w:sz w:val="26"/>
+          <w:szCs w:val="26"/>
+        </w:rPr>
+        <w:t>forestOwnerPhoneNumber</w:t>
+      </w:r>
+      <w:r>
+        <w:rPr>
+          <w:sz w:val="26"/>
+          <w:szCs w:val="26"/>
+        </w:rPr>
+        <w:t>}</w:t>
+      </w:r>
+      <w:r>
+        <w:rPr>
+          <w:sz w:val="26"/>
+          <w:szCs w:val="26"/>
+        </w:rPr>
+        <w:t>}</w:t>
       </w:r>
     </w:p>
     <w:p>
@@ -283,7 +388,35 @@
           <w:sz w:val="26"/>
           <w:szCs w:val="26"/>
         </w:rPr>
-        <w:t>{miningArea}</w:t>
+        <w:t>{</w:t>
+      </w:r>
+      <w:r>
+        <w:rPr>
+          <w:sz w:val="26"/>
+          <w:szCs w:val="26"/>
+        </w:rPr>
+        <w:t>{</w:t>
+      </w:r>
+      <w:r>
+        <w:rPr>
+          <w:sz w:val="26"/>
+          <w:szCs w:val="26"/>
+        </w:rPr>
+        <w:t>miningArea</w:t>
+      </w:r>
+      <w:r>
+        <w:rPr>
+          <w:sz w:val="26"/>
+          <w:szCs w:val="26"/>
+        </w:rPr>
+        <w:t>}</w:t>
+      </w:r>
+      <w:r>
+        <w:rPr>
+          <w:sz w:val="26"/>
+          <w:szCs w:val="26"/>
+        </w:rPr>
+        <w:t>}</w:t>
       </w:r>
       <w:r>
         <w:rPr>
@@ -309,7 +442,35 @@
           <w:sz w:val="26"/>
           <w:szCs w:val="26"/>
         </w:rPr>
-        <w:t>{forestAddr}</w:t>
+        <w:t>{</w:t>
+      </w:r>
+      <w:r>
+        <w:rPr>
+          <w:sz w:val="26"/>
+          <w:szCs w:val="26"/>
+        </w:rPr>
+        <w:t>{</w:t>
+      </w:r>
+      <w:r>
+        <w:rPr>
+          <w:sz w:val="26"/>
+          <w:szCs w:val="26"/>
+        </w:rPr>
+        <w:t>forestAddr</w:t>
+      </w:r>
+      <w:r>
+        <w:rPr>
+          <w:sz w:val="26"/>
+          <w:szCs w:val="26"/>
+        </w:rPr>
+        <w:t>}</w:t>
+      </w:r>
+      <w:r>
+        <w:rPr>
+          <w:sz w:val="26"/>
+          <w:szCs w:val="26"/>
+        </w:rPr>
+        <w:t>}</w:t>
       </w:r>
     </w:p>
     <w:p>
@@ -328,7 +489,35 @@
           <w:sz w:val="26"/>
           <w:szCs w:val="26"/>
         </w:rPr>
-        <w:t>{typeMining}</w:t>
+        <w:t>{</w:t>
+      </w:r>
+      <w:r>
+        <w:rPr>
+          <w:sz w:val="26"/>
+          <w:szCs w:val="26"/>
+        </w:rPr>
+        <w:t>{</w:t>
+      </w:r>
+      <w:r>
+        <w:rPr>
+          <w:sz w:val="26"/>
+          <w:szCs w:val="26"/>
+        </w:rPr>
+        <w:t>typeMining</w:t>
+      </w:r>
+      <w:r>
+        <w:rPr>
+          <w:sz w:val="26"/>
+          <w:szCs w:val="26"/>
+        </w:rPr>
+        <w:t>}</w:t>
+      </w:r>
+      <w:r>
+        <w:rPr>
+          <w:sz w:val="26"/>
+          <w:szCs w:val="26"/>
+        </w:rPr>
+        <w:t>}</w:t>
       </w:r>
     </w:p>
     <w:p>
@@ -347,7 +536,35 @@
           <w:sz w:val="26"/>
           <w:szCs w:val="26"/>
         </w:rPr>
-        <w:t>{projectedMiningOutput}</w:t>
+        <w:t>{</w:t>
+      </w:r>
+      <w:r>
+        <w:rPr>
+          <w:sz w:val="26"/>
+          <w:szCs w:val="26"/>
+        </w:rPr>
+        <w:t>{</w:t>
+      </w:r>
+      <w:r>
+        <w:rPr>
+          <w:sz w:val="26"/>
+          <w:szCs w:val="26"/>
+        </w:rPr>
+        <w:t>projectedMiningOutput</w:t>
+      </w:r>
+      <w:r>
+        <w:rPr>
+          <w:sz w:val="26"/>
+          <w:szCs w:val="26"/>
+        </w:rPr>
+        <w:t>}</w:t>
+      </w:r>
+      <w:r>
+        <w:rPr>
+          <w:sz w:val="26"/>
+          <w:szCs w:val="26"/>
+        </w:rPr>
+        <w:t>}</w:t>
       </w:r>
     </w:p>
     <w:p>
@@ -378,7 +595,35 @@
           <w:sz w:val="26"/>
           <w:szCs w:val="26"/>
         </w:rPr>
-        <w:t>{miningFromDate}</w:t>
+        <w:t>{</w:t>
+      </w:r>
+      <w:r>
+        <w:rPr>
+          <w:sz w:val="26"/>
+          <w:szCs w:val="26"/>
+        </w:rPr>
+        <w:t>{</w:t>
+      </w:r>
+      <w:r>
+        <w:rPr>
+          <w:sz w:val="26"/>
+          <w:szCs w:val="26"/>
+        </w:rPr>
+        <w:t>miningFromDate</w:t>
+      </w:r>
+      <w:r>
+        <w:rPr>
+          <w:sz w:val="26"/>
+          <w:szCs w:val="26"/>
+        </w:rPr>
+        <w:t>}</w:t>
+      </w:r>
+      <w:r>
+        <w:rPr>
+          <w:sz w:val="26"/>
+          <w:szCs w:val="26"/>
+        </w:rPr>
+        <w:t>}</w:t>
       </w:r>
       <w:r>
         <w:rPr>
@@ -392,7 +637,35 @@
           <w:sz w:val="26"/>
           <w:szCs w:val="26"/>
         </w:rPr>
-        <w:t>{miningToDate}</w:t>
+        <w:t>{</w:t>
+      </w:r>
+      <w:r>
+        <w:rPr>
+          <w:sz w:val="26"/>
+          <w:szCs w:val="26"/>
+        </w:rPr>
+        <w:t>{</w:t>
+      </w:r>
+      <w:r>
+        <w:rPr>
+          <w:sz w:val="26"/>
+          <w:szCs w:val="26"/>
+        </w:rPr>
+        <w:t>miningToDate</w:t>
+      </w:r>
+      <w:r>
+        <w:rPr>
+          <w:sz w:val="26"/>
+          <w:szCs w:val="26"/>
+        </w:rPr>
+        <w:t>}</w:t>
+      </w:r>
+      <w:r>
+        <w:rPr>
+          <w:sz w:val="26"/>
+          <w:szCs w:val="26"/>
+        </w:rPr>
+        <w:t>}</w:t>
       </w:r>
     </w:p>
     <w:tbl>
@@ -417,12 +690,6 @@
         <w:gridCol w:w="4891"/>
       </w:tblGrid>
       <w:tr>
-        <w:tblPrEx>
-          <w:tblCellMar>
-            <w:top w:w="0" w:type="dxa"/>
-            <w:bottom w:w="0" w:type="dxa"/>
-          </w:tblCellMar>
-        </w:tblPrEx>
         <w:tc>
           <w:tcPr>
             <w:tcW w:w="2500" w:type="pct"/>
@@ -457,7 +724,7 @@
                 <w:sz w:val="26"/>
                 <w:szCs w:val="26"/>
               </w:rPr>
-              <w:t xml:space="preserve">Xã Tân Dĩnh, </w:t>
+              <w:t>{</w:t>
             </w:r>
             <w:r>
               <w:rPr>
@@ -466,7 +733,88 @@
                 <w:sz w:val="26"/>
                 <w:szCs w:val="26"/>
               </w:rPr>
-              <w:t>{miningFromdate}</w:t>
+              <w:t>{</w:t>
+            </w:r>
+            <w:r>
+              <w:rPr>
+                <w:i/>
+                <w:iCs/>
+                <w:sz w:val="26"/>
+                <w:szCs w:val="26"/>
+              </w:rPr>
+              <w:t>forest</w:t>
+            </w:r>
+            <w:r>
+              <w:rPr>
+                <w:i/>
+                <w:iCs/>
+                <w:sz w:val="26"/>
+                <w:szCs w:val="26"/>
+              </w:rPr>
+              <w:t>City</w:t>
+            </w:r>
+            <w:r>
+              <w:rPr>
+                <w:i/>
+                <w:iCs/>
+                <w:sz w:val="26"/>
+                <w:szCs w:val="26"/>
+              </w:rPr>
+              <w:t>}</w:t>
+            </w:r>
+            <w:r>
+              <w:rPr>
+                <w:i/>
+                <w:iCs/>
+                <w:sz w:val="26"/>
+                <w:szCs w:val="26"/>
+              </w:rPr>
+              <w:t xml:space="preserve">}, </w:t>
+            </w:r>
+            <w:r>
+              <w:rPr>
+                <w:i/>
+                <w:iCs/>
+                <w:sz w:val="26"/>
+                <w:szCs w:val="26"/>
+              </w:rPr>
+              <w:t>{</w:t>
+            </w:r>
+            <w:r>
+              <w:rPr>
+                <w:i/>
+                <w:iCs/>
+                <w:sz w:val="26"/>
+                <w:szCs w:val="26"/>
+              </w:rPr>
+              <w:t>{</w:t>
+            </w:r>
+            <w:r>
+              <w:rPr>
+                <w:i/>
+                <w:iCs/>
+                <w:sz w:val="26"/>
+                <w:szCs w:val="26"/>
+              </w:rPr>
+              <w:t>miningFromdate</w:t>
+            </w:r>
+            <w:r>
+              <w:rPr>
+                <w:i/>
+                <w:iCs/>
+                <w:sz w:val="26"/>
+                <w:szCs w:val="26"/>
+              </w:rPr>
+              <w:t>}</w:t>
+            </w:r>
+            <w:r>
+              <w:rPr>
+                <w:i/>
+                <w:iCs/>
+                <w:sz w:val="26"/>
+                <w:szCs w:val="26"/>
+              </w:rPr>
+              <w:t>}</w:t>
             </w:r>
           </w:p>
           <w:p>

</xml_diff>

<commit_message>
đã xong hồ sơ gỗ . giờ chuyển sang lệnh sản xuất
</commit_message>
<xml_diff>
--- a/my_custom_addons/dl_wood_traceability/static/TEMPLATES/TEMPLATE_PAKT.docx
+++ b/my_custom_addons/dl_wood_traceability/static/TEMPLATES/TEMPLATE_PAKT.docx
@@ -417,6 +417,13 @@
           <w:szCs w:val="26"/>
         </w:rPr>
         <w:t>}</w:t>
+      </w:r>
+      <w:r>
+        <w:rPr>
+          <w:sz w:val="26"/>
+          <w:szCs w:val="26"/>
+        </w:rPr>
+        <w:t xml:space="preserve"> </w:t>
       </w:r>
       <w:r>
         <w:rPr>

</xml_diff>